<commit_message>
forbedringer på VarForc tidsserie plot
</commit_message>
<xml_diff>
--- a/to do liste klima.docx
+++ b/to do liste klima.docx
@@ -42,28 +42,14 @@
           <w:sz w:val="28"/>
           <w:szCs w:val="28"/>
         </w:rPr>
-        <w:t xml:space="preserve">Plotte </w:t>
+        <w:t>Lav Historical</w:t>
       </w:r>
       <w:r>
         <w:rPr>
           <w:sz w:val="28"/>
           <w:szCs w:val="28"/>
         </w:rPr>
-        <w:t xml:space="preserve">nutidig </w:t>
-      </w:r>
-      <w:r>
-        <w:rPr>
-          <w:sz w:val="28"/>
-          <w:szCs w:val="28"/>
-        </w:rPr>
-        <w:t xml:space="preserve">zonal mean temperature profile </w:t>
-      </w:r>
-      <w:r>
-        <w:rPr>
-          <w:sz w:val="28"/>
-          <w:szCs w:val="28"/>
-        </w:rPr>
-        <w:t>data på temperature profile plottet</w:t>
+        <w:t xml:space="preserve"> mode der arver fra variable forcing mode. I den mode:</w:t>
       </w:r>
     </w:p>
     <w:p>
@@ -84,7 +70,28 @@
           <w:sz w:val="28"/>
           <w:szCs w:val="28"/>
         </w:rPr>
-        <w:t>Fjerne ”initial” fra temperature profile plottet</w:t>
+        <w:t xml:space="preserve">Plotte </w:t>
+      </w:r>
+      <w:r>
+        <w:rPr>
+          <w:sz w:val="28"/>
+          <w:szCs w:val="28"/>
+        </w:rPr>
+        <w:t xml:space="preserve">nutidig </w:t>
+      </w:r>
+      <w:r>
+        <w:rPr>
+          <w:sz w:val="28"/>
+          <w:szCs w:val="28"/>
+        </w:rPr>
+        <w:t xml:space="preserve">zonal mean temperature profile </w:t>
+      </w:r>
+      <w:r>
+        <w:rPr>
+          <w:sz w:val="28"/>
+          <w:szCs w:val="28"/>
+        </w:rPr>
+        <w:t>data på temperature profile plottet</w:t>
       </w:r>
     </w:p>
     <w:p>
@@ -105,8 +112,18 @@
           <w:sz w:val="28"/>
           <w:szCs w:val="28"/>
         </w:rPr>
-        <w:t xml:space="preserve">Få en global average temperature tidsserie 1750-2024 fra Eigil så den kan plottet sammen med modellens forudsigelser i global mean surface temperature plottet. </w:t>
+        <w:t>Få en global average temperature tidsserie 1750-2024 fra Eigil så den kan plottet sammen med modellens forudsigelser i global mean surface temperature plottet. (Det her minder teknisk meget om at plotte radiativ forcing tidsserien så det burde gå hurtigt når jeg først har filen)</w:t>
       </w:r>
+    </w:p>
+    <w:p>
+      <w:pPr>
+        <w:pStyle w:val="Listeafsnit"/>
+        <w:spacing w:line="360" w:lineRule="auto"/>
+        <w:rPr>
+          <w:sz w:val="28"/>
+          <w:szCs w:val="28"/>
+        </w:rPr>
+      </w:pPr>
     </w:p>
     <w:p>
       <w:pPr>
@@ -126,7 +143,42 @@
           <w:sz w:val="28"/>
           <w:szCs w:val="28"/>
         </w:rPr>
+        <w:t>Fjerne ”initial” fra temperature profile plottet</w:t>
+      </w:r>
+      <w:r>
+        <w:rPr>
+          <w:sz w:val="28"/>
+          <w:szCs w:val="28"/>
+        </w:rPr>
+        <w:t xml:space="preserve"> </w:t>
+      </w:r>
+    </w:p>
+    <w:p>
+      <w:pPr>
+        <w:pStyle w:val="Listeafsnit"/>
+        <w:numPr>
+          <w:ilvl w:val="0"/>
+          <w:numId w:val="1"/>
+        </w:numPr>
+        <w:spacing w:line="360" w:lineRule="auto"/>
+        <w:rPr>
+          <w:sz w:val="28"/>
+          <w:szCs w:val="28"/>
+        </w:rPr>
+      </w:pPr>
+      <w:r>
+        <w:rPr>
+          <w:sz w:val="28"/>
+          <w:szCs w:val="28"/>
+        </w:rPr>
         <w:t xml:space="preserve">Sikre at VarForc er kompatibel med de andre modes </w:t>
+      </w:r>
+      <w:r>
+        <w:rPr>
+          <w:sz w:val="28"/>
+          <w:szCs w:val="28"/>
+        </w:rPr>
+        <w:t>(Kør med variable seadepth)</w:t>
       </w:r>
     </w:p>
     <w:p>

</xml_diff>

<commit_message>
tilføjede historical class i modes og noget kode der skal bruges til at plotte virkelig temperaturdata i outputs
</commit_message>
<xml_diff>
--- a/to do liste klima.docx
+++ b/to do liste klima.docx
@@ -56,7 +56,7 @@
       <w:pPr>
         <w:pStyle w:val="Listeafsnit"/>
         <w:numPr>
-          <w:ilvl w:val="0"/>
+          <w:ilvl w:val="2"/>
           <w:numId w:val="1"/>
         </w:numPr>
         <w:spacing w:line="360" w:lineRule="auto"/>
@@ -70,29 +70,95 @@
           <w:sz w:val="28"/>
           <w:szCs w:val="28"/>
         </w:rPr>
-        <w:t xml:space="preserve">Plotte </w:t>
+        <w:t>Plotte nutidig zonal mean temperature profile data på temperature profile plottet</w:t>
+      </w:r>
+    </w:p>
+    <w:p>
+      <w:pPr>
+        <w:pStyle w:val="Listeafsnit"/>
+        <w:numPr>
+          <w:ilvl w:val="2"/>
+          <w:numId w:val="1"/>
+        </w:numPr>
+        <w:spacing w:line="360" w:lineRule="auto"/>
+        <w:rPr>
+          <w:sz w:val="28"/>
+          <w:szCs w:val="28"/>
+        </w:rPr>
+      </w:pPr>
+      <w:r>
+        <w:rPr>
+          <w:sz w:val="28"/>
+          <w:szCs w:val="28"/>
+        </w:rPr>
+        <w:t>Få en global average temperature tidsserie 1750-2024 fra Eigil så den kan plottet sammen med modellens forudsigelser i global mean surface temperature plottet. (Det her minder teknisk meget om at plotte radiativ forcing tidsserien så det burde gå hurtigt når jeg først har filen)</w:t>
       </w:r>
       <w:r>
         <w:rPr>
           <w:sz w:val="28"/>
           <w:szCs w:val="28"/>
         </w:rPr>
-        <w:t xml:space="preserve">nutidig </w:t>
+        <w:t xml:space="preserve"> </w:t>
+      </w:r>
+    </w:p>
+    <w:p>
+      <w:pPr>
+        <w:pStyle w:val="Listeafsnit"/>
+        <w:numPr>
+          <w:ilvl w:val="2"/>
+          <w:numId w:val="1"/>
+        </w:numPr>
+        <w:spacing w:line="360" w:lineRule="auto"/>
+        <w:rPr>
+          <w:sz w:val="28"/>
+          <w:szCs w:val="28"/>
+        </w:rPr>
+      </w:pPr>
+      <w:r>
+        <w:rPr>
+          <w:sz w:val="28"/>
+          <w:szCs w:val="28"/>
+        </w:rPr>
+        <w:t xml:space="preserve">Der er et </w:t>
       </w:r>
       <w:r>
         <w:rPr>
           <w:sz w:val="28"/>
           <w:szCs w:val="28"/>
         </w:rPr>
-        <w:t xml:space="preserve">zonal mean temperature profile </w:t>
+        <w:t>sandsynligt</w:t>
       </w:r>
       <w:r>
         <w:rPr>
           <w:sz w:val="28"/>
           <w:szCs w:val="28"/>
         </w:rPr>
-        <w:t>data på temperature profile plottet</w:t>
+        <w:t xml:space="preserve"> problem med indeksering i </w:t>
       </w:r>
+      <w:r>
+        <w:rPr>
+          <w:sz w:val="28"/>
+          <w:szCs w:val="28"/>
+        </w:rPr>
+        <w:t xml:space="preserve">simulationstemperatur arrayet fordi det indeholder kontrolår, sammenlignet med historisk temperaturarrayet der ikke indeholder kontrolår. Det skal fikses så de enten begge indeholder kontrolår eller begge ikke gør det. </w:t>
+      </w:r>
+      <w:r>
+        <w:rPr>
+          <w:sz w:val="28"/>
+          <w:szCs w:val="28"/>
+        </w:rPr>
+        <w:t xml:space="preserve">Dette problem har bl.a. at gøre med hvorvidt jeg concatenater med kontrol array når jeg importerer data fra csv. </w:t>
+      </w:r>
+    </w:p>
+    <w:p>
+      <w:pPr>
+        <w:pStyle w:val="Listeafsnit"/>
+        <w:spacing w:line="360" w:lineRule="auto"/>
+        <w:rPr>
+          <w:sz w:val="28"/>
+          <w:szCs w:val="28"/>
+        </w:rPr>
+      </w:pPr>
     </w:p>
     <w:p>
       <w:pPr>
@@ -112,18 +178,15 @@
           <w:sz w:val="28"/>
           <w:szCs w:val="28"/>
         </w:rPr>
-        <w:t>Få en global average temperature tidsserie 1750-2024 fra Eigil så den kan plottet sammen med modellens forudsigelser i global mean surface temperature plottet. (Det her minder teknisk meget om at plotte radiativ forcing tidsserien så det burde gå hurtigt når jeg først har filen)</w:t>
+        <w:t xml:space="preserve">Sikre at VarForc er kompatibel med de andre modes </w:t>
       </w:r>
-    </w:p>
-    <w:p>
-      <w:pPr>
-        <w:pStyle w:val="Listeafsnit"/>
-        <w:spacing w:line="360" w:lineRule="auto"/>
-        <w:rPr>
-          <w:sz w:val="28"/>
-          <w:szCs w:val="28"/>
-        </w:rPr>
-      </w:pPr>
+      <w:r>
+        <w:rPr>
+          <w:sz w:val="28"/>
+          <w:szCs w:val="28"/>
+        </w:rPr>
+        <w:t>(Kør med variable seadepth)</w:t>
+      </w:r>
     </w:p>
     <w:p>
       <w:pPr>
@@ -143,42 +206,14 @@
           <w:sz w:val="28"/>
           <w:szCs w:val="28"/>
         </w:rPr>
-        <w:t>Fjerne ”initial” fra temperature profile plottet</w:t>
+        <w:t>Sikre at c</w:t>
       </w:r>
       <w:r>
         <w:rPr>
           <w:sz w:val="28"/>
           <w:szCs w:val="28"/>
         </w:rPr>
-        <w:t xml:space="preserve"> </w:t>
-      </w:r>
-    </w:p>
-    <w:p>
-      <w:pPr>
-        <w:pStyle w:val="Listeafsnit"/>
-        <w:numPr>
-          <w:ilvl w:val="0"/>
-          <w:numId w:val="1"/>
-        </w:numPr>
-        <w:spacing w:line="360" w:lineRule="auto"/>
-        <w:rPr>
-          <w:sz w:val="28"/>
-          <w:szCs w:val="28"/>
-        </w:rPr>
-      </w:pPr>
-      <w:r>
-        <w:rPr>
-          <w:sz w:val="28"/>
-          <w:szCs w:val="28"/>
-        </w:rPr>
-        <w:t xml:space="preserve">Sikre at VarForc er kompatibel med de andre modes </w:t>
-      </w:r>
-      <w:r>
-        <w:rPr>
-          <w:sz w:val="28"/>
-          <w:szCs w:val="28"/>
-        </w:rPr>
-        <w:t>(Kør med variable seadepth)</w:t>
+        <w:t>trl_years er stor nok til at modellen opnår ligevægt</w:t>
       </w:r>
     </w:p>
     <w:p>
@@ -232,7 +267,7 @@
         <w:rFonts w:ascii="Courier New" w:hAnsi="Courier New" w:cs="Courier New" w:hint="default"/>
       </w:rPr>
     </w:lvl>
-    <w:lvl w:ilvl="2" w:tplc="04060005" w:tentative="1">
+    <w:lvl w:ilvl="2" w:tplc="04060005">
       <w:start w:val="1"/>
       <w:numFmt w:val="bullet"/>
       <w:lvlText w:val=""/>

</xml_diff>

<commit_message>
fik temperatur breddegrad data plottet til at virke
</commit_message>
<xml_diff>
--- a/to do liste klima.docx
+++ b/to do liste klima.docx
@@ -42,56 +42,28 @@
           <w:sz w:val="28"/>
           <w:szCs w:val="28"/>
         </w:rPr>
-        <w:t>Lav Historical</w:t>
-      </w:r>
-      <w:r>
-        <w:rPr>
-          <w:sz w:val="28"/>
-          <w:szCs w:val="28"/>
-        </w:rPr>
-        <w:t xml:space="preserve"> mode der arver fra variable forcing mode. I den mode:</w:t>
-      </w:r>
-    </w:p>
-    <w:p>
-      <w:pPr>
-        <w:pStyle w:val="Listeafsnit"/>
-        <w:numPr>
-          <w:ilvl w:val="2"/>
-          <w:numId w:val="1"/>
-        </w:numPr>
-        <w:spacing w:line="360" w:lineRule="auto"/>
-        <w:rPr>
-          <w:sz w:val="28"/>
-          <w:szCs w:val="28"/>
-        </w:rPr>
-      </w:pPr>
-      <w:r>
-        <w:rPr>
-          <w:sz w:val="28"/>
-          <w:szCs w:val="28"/>
-        </w:rPr>
-        <w:t>Plotte nutidig zonal mean temperature profile data på temperature profile plottet</w:t>
-      </w:r>
-    </w:p>
-    <w:p>
-      <w:pPr>
-        <w:pStyle w:val="Listeafsnit"/>
-        <w:numPr>
-          <w:ilvl w:val="2"/>
-          <w:numId w:val="1"/>
-        </w:numPr>
-        <w:spacing w:line="360" w:lineRule="auto"/>
-        <w:rPr>
-          <w:sz w:val="28"/>
-          <w:szCs w:val="28"/>
-        </w:rPr>
-      </w:pPr>
-      <w:r>
-        <w:rPr>
-          <w:sz w:val="28"/>
-          <w:szCs w:val="28"/>
-        </w:rPr>
-        <w:t>Få en global average temperature tidsserie 1750-2024 fra Eigil så den kan plottet sammen med modellens forudsigelser i global mean surface temperature plottet. (Det her minder teknisk meget om at plotte radiativ forcing tidsserien så det burde gå hurtigt når jeg først har filen)</w:t>
+        <w:t xml:space="preserve">1. </w:t>
+      </w:r>
+      <w:r>
+        <w:rPr>
+          <w:sz w:val="28"/>
+          <w:szCs w:val="28"/>
+        </w:rPr>
+        <w:t>Få en global average temperature tidsserie 1750-2024 fra Eigil så den kan plotte</w:t>
+      </w:r>
+      <w:r>
+        <w:rPr>
+          <w:sz w:val="28"/>
+          <w:szCs w:val="28"/>
+        </w:rPr>
+        <w:t>s</w:t>
+      </w:r>
+      <w:r>
+        <w:rPr>
+          <w:sz w:val="28"/>
+          <w:szCs w:val="28"/>
+        </w:rPr>
+        <w:t xml:space="preserve"> sammen med modellens forudsigelser i global mean surface temperature plottet. (Det her minder teknisk meget om at plotte radiativ forcing tidsserien så det burde gå hurtigt når jeg først har filen)</w:t>
       </w:r>
       <w:r>
         <w:rPr>
@@ -99,55 +71,6 @@
           <w:szCs w:val="28"/>
         </w:rPr>
         <w:t xml:space="preserve"> </w:t>
-      </w:r>
-    </w:p>
-    <w:p>
-      <w:pPr>
-        <w:pStyle w:val="Listeafsnit"/>
-        <w:numPr>
-          <w:ilvl w:val="2"/>
-          <w:numId w:val="1"/>
-        </w:numPr>
-        <w:spacing w:line="360" w:lineRule="auto"/>
-        <w:rPr>
-          <w:sz w:val="28"/>
-          <w:szCs w:val="28"/>
-        </w:rPr>
-      </w:pPr>
-      <w:r>
-        <w:rPr>
-          <w:sz w:val="28"/>
-          <w:szCs w:val="28"/>
-        </w:rPr>
-        <w:t xml:space="preserve">Der er et </w:t>
-      </w:r>
-      <w:r>
-        <w:rPr>
-          <w:sz w:val="28"/>
-          <w:szCs w:val="28"/>
-        </w:rPr>
-        <w:t>sandsynligt</w:t>
-      </w:r>
-      <w:r>
-        <w:rPr>
-          <w:sz w:val="28"/>
-          <w:szCs w:val="28"/>
-        </w:rPr>
-        <w:t xml:space="preserve"> problem med indeksering i </w:t>
-      </w:r>
-      <w:r>
-        <w:rPr>
-          <w:sz w:val="28"/>
-          <w:szCs w:val="28"/>
-        </w:rPr>
-        <w:t xml:space="preserve">simulationstemperatur arrayet fordi det indeholder kontrolår, sammenlignet med historisk temperaturarrayet der ikke indeholder kontrolår. Det skal fikses så de enten begge indeholder kontrolår eller begge ikke gør det. </w:t>
-      </w:r>
-      <w:r>
-        <w:rPr>
-          <w:sz w:val="28"/>
-          <w:szCs w:val="28"/>
-        </w:rPr>
-        <w:t xml:space="preserve">Dette problem har bl.a. at gøre med hvorvidt jeg concatenater med kontrol array når jeg importerer data fra csv. </w:t>
       </w:r>
     </w:p>
     <w:p>
@@ -178,15 +101,53 @@
           <w:sz w:val="28"/>
           <w:szCs w:val="28"/>
         </w:rPr>
-        <w:t xml:space="preserve">Sikre at VarForc er kompatibel med de andre modes </w:t>
-      </w:r>
-      <w:r>
-        <w:rPr>
-          <w:sz w:val="28"/>
-          <w:szCs w:val="28"/>
-        </w:rPr>
-        <w:t>(Kør med variable seadepth)</w:t>
-      </w:r>
+        <w:t xml:space="preserve">2. </w:t>
+      </w:r>
+      <w:r>
+        <w:rPr>
+          <w:sz w:val="28"/>
+          <w:szCs w:val="28"/>
+        </w:rPr>
+        <w:t xml:space="preserve">Der er et </w:t>
+      </w:r>
+      <w:r>
+        <w:rPr>
+          <w:sz w:val="28"/>
+          <w:szCs w:val="28"/>
+        </w:rPr>
+        <w:t>sandsynligt</w:t>
+      </w:r>
+      <w:r>
+        <w:rPr>
+          <w:sz w:val="28"/>
+          <w:szCs w:val="28"/>
+        </w:rPr>
+        <w:t xml:space="preserve"> problem med indeksering i </w:t>
+      </w:r>
+      <w:r>
+        <w:rPr>
+          <w:sz w:val="28"/>
+          <w:szCs w:val="28"/>
+        </w:rPr>
+        <w:t xml:space="preserve">simulationstemperatur arrayet fordi det indeholder kontrolår, sammenlignet med historisk temperaturarrayet der ikke indeholder kontrolår. Det skal fikses så de enten begge indeholder kontrolår eller begge ikke gør det. </w:t>
+      </w:r>
+      <w:r>
+        <w:rPr>
+          <w:sz w:val="28"/>
+          <w:szCs w:val="28"/>
+        </w:rPr>
+        <w:t xml:space="preserve">Dette problem har bl.a. at gøre med hvorvidt jeg concatenater med kontrol array når jeg importerer data fra csv. </w:t>
+      </w:r>
+    </w:p>
+    <w:p>
+      <w:pPr>
+        <w:pStyle w:val="Listeafsnit"/>
+        <w:spacing w:line="360" w:lineRule="auto"/>
+        <w:rPr>
+          <w:sz w:val="28"/>
+          <w:szCs w:val="28"/>
+        </w:rPr>
+      </w:pPr>
     </w:p>
     <w:p>
       <w:pPr>
@@ -206,19 +167,112 @@
           <w:sz w:val="28"/>
           <w:szCs w:val="28"/>
         </w:rPr>
-        <w:t>Sikre at c</w:t>
-      </w:r>
-      <w:r>
-        <w:rPr>
-          <w:sz w:val="28"/>
-          <w:szCs w:val="28"/>
-        </w:rPr>
-        <w:t>trl_years er stor nok til at modellen opnår ligevægt</w:t>
+        <w:t xml:space="preserve">3. </w:t>
+      </w:r>
+      <w:r>
+        <w:rPr>
+          <w:sz w:val="28"/>
+          <w:szCs w:val="28"/>
+        </w:rPr>
+        <w:t>Sikre at VarForc</w:t>
+      </w:r>
+      <w:r>
+        <w:rPr>
+          <w:sz w:val="28"/>
+          <w:szCs w:val="28"/>
+        </w:rPr>
+        <w:t xml:space="preserve"> og Historical</w:t>
+      </w:r>
+      <w:r>
+        <w:rPr>
+          <w:sz w:val="28"/>
+          <w:szCs w:val="28"/>
+        </w:rPr>
+        <w:t xml:space="preserve"> er kompatibel med </w:t>
+      </w:r>
+      <w:r>
+        <w:rPr>
+          <w:sz w:val="28"/>
+          <w:szCs w:val="28"/>
+        </w:rPr>
+        <w:t>variable seadepth</w:t>
+      </w:r>
+      <w:r>
+        <w:rPr>
+          <w:sz w:val="28"/>
+          <w:szCs w:val="28"/>
+        </w:rPr>
+        <w:t xml:space="preserve"> og hinanden</w:t>
+      </w:r>
+      <w:r>
+        <w:rPr>
+          <w:sz w:val="28"/>
+          <w:szCs w:val="28"/>
+        </w:rPr>
+        <w:t xml:space="preserve">. Finde den rigtige seadepth til specielt Historical for at få korrekte forudsigelser, hvilket nemmest kan gøres når punkt 1 er gjort. </w:t>
+      </w:r>
+      <w:r>
+        <w:rPr>
+          <w:sz w:val="28"/>
+          <w:szCs w:val="28"/>
+        </w:rPr>
+        <w:t>For Historical giver det måske mening at påtvinge 250 m da det giver</w:t>
+      </w:r>
+      <w:r>
+        <w:rPr>
+          <w:sz w:val="28"/>
+          <w:szCs w:val="28"/>
+        </w:rPr>
+        <w:t xml:space="preserve"> cirka</w:t>
+      </w:r>
+      <w:r>
+        <w:rPr>
+          <w:sz w:val="28"/>
+          <w:szCs w:val="28"/>
+        </w:rPr>
+        <w:t xml:space="preserve"> den rigtige temperaturstigning</w:t>
+      </w:r>
+      <w:r>
+        <w:rPr>
+          <w:sz w:val="28"/>
+          <w:szCs w:val="28"/>
+        </w:rPr>
+        <w:t xml:space="preserve"> i 2024</w:t>
+      </w:r>
+      <w:r>
+        <w:rPr>
+          <w:sz w:val="28"/>
+          <w:szCs w:val="28"/>
+        </w:rPr>
+        <w:t xml:space="preserve">, men det </w:t>
+      </w:r>
+      <w:r>
+        <w:rPr>
+          <w:sz w:val="28"/>
+          <w:szCs w:val="28"/>
+        </w:rPr>
+        <w:t xml:space="preserve">skal </w:t>
+      </w:r>
+      <w:r>
+        <w:rPr>
+          <w:sz w:val="28"/>
+          <w:szCs w:val="28"/>
+        </w:rPr>
+        <w:t xml:space="preserve">integreres med variable seadepth til at få den zonale temperaturprofil til at passe bedre med data. </w:t>
       </w:r>
     </w:p>
     <w:p>
       <w:pPr>
         <w:pStyle w:val="Listeafsnit"/>
+        <w:rPr>
+          <w:sz w:val="28"/>
+          <w:szCs w:val="28"/>
+        </w:rPr>
+      </w:pPr>
+    </w:p>
+    <w:p>
+      <w:pPr>
+        <w:pStyle w:val="Listeafsnit"/>
         <w:spacing w:line="360" w:lineRule="auto"/>
         <w:rPr>
           <w:sz w:val="28"/>
@@ -226,7 +280,41 @@
         </w:rPr>
       </w:pPr>
     </w:p>
-    <w:p/>
+    <w:p>
+      <w:pPr>
+        <w:pStyle w:val="Listeafsnit"/>
+        <w:numPr>
+          <w:ilvl w:val="0"/>
+          <w:numId w:val="1"/>
+        </w:numPr>
+        <w:spacing w:line="360" w:lineRule="auto"/>
+        <w:rPr>
+          <w:sz w:val="28"/>
+          <w:szCs w:val="28"/>
+        </w:rPr>
+      </w:pPr>
+      <w:r>
+        <w:rPr>
+          <w:sz w:val="28"/>
+          <w:szCs w:val="28"/>
+        </w:rPr>
+        <w:t xml:space="preserve">4. </w:t>
+      </w:r>
+      <w:r>
+        <w:rPr>
+          <w:sz w:val="28"/>
+          <w:szCs w:val="28"/>
+        </w:rPr>
+        <w:t>Sikre at c</w:t>
+      </w:r>
+      <w:r>
+        <w:rPr>
+          <w:sz w:val="28"/>
+          <w:szCs w:val="28"/>
+        </w:rPr>
+        <w:t>trl_years er stor nok til at modellen opnår ligevægt</w:t>
+      </w:r>
+    </w:p>
     <w:sectPr>
       <w:pgSz w:w="11906" w:h="16838"/>
       <w:pgMar w:top="1701" w:right="1134" w:bottom="1701" w:left="1134" w:header="708" w:footer="708" w:gutter="0"/>
@@ -242,7 +330,7 @@
   <w:abstractNum w:abstractNumId="0" w15:restartNumberingAfterBreak="0">
     <w:nsid w:val="546F5F86"/>
     <w:multiLevelType w:val="hybridMultilevel"/>
-    <w:tmpl w:val="C8D4FB00"/>
+    <w:tmpl w:val="3FDE74CA"/>
     <w:lvl w:ilvl="0" w:tplc="04060009">
       <w:start w:val="1"/>
       <w:numFmt w:val="bullet"/>
@@ -267,10 +355,10 @@
         <w:rFonts w:ascii="Courier New" w:hAnsi="Courier New" w:cs="Courier New" w:hint="default"/>
       </w:rPr>
     </w:lvl>
-    <w:lvl w:ilvl="2" w:tplc="04060005">
+    <w:lvl w:ilvl="2" w:tplc="04060009">
       <w:start w:val="1"/>
       <w:numFmt w:val="bullet"/>
-      <w:lvlText w:val=""/>
+      <w:lvlText w:val=""/>
       <w:lvlJc w:val="left"/>
       <w:pPr>
         <w:ind w:left="2160" w:hanging="360"/>

</xml_diff>

<commit_message>
fixed bugs in Hist mode, made it incompatible with VarForc and SeaVar, Hist no longer subclass of VarForc
</commit_message>
<xml_diff>
--- a/to do liste klima.docx
+++ b/to do liste klima.docx
@@ -49,21 +49,14 @@
           <w:sz w:val="28"/>
           <w:szCs w:val="28"/>
         </w:rPr>
-        <w:t>Få en global average temperature tidsserie 1750-2024 fra Eigil så den kan plotte</w:t>
-      </w:r>
-      <w:r>
-        <w:rPr>
-          <w:sz w:val="28"/>
-          <w:szCs w:val="28"/>
-        </w:rPr>
-        <w:t>s</w:t>
-      </w:r>
-      <w:r>
-        <w:rPr>
-          <w:sz w:val="28"/>
-          <w:szCs w:val="28"/>
-        </w:rPr>
-        <w:t xml:space="preserve"> sammen med modellens forudsigelser i global mean surface temperature plottet. (Det her minder teknisk meget om at plotte radiativ forcing tidsserien så det burde gå hurtigt når jeg først har filen)</w:t>
+        <w:t xml:space="preserve">Plot Eigils temperaturdata </w:t>
+      </w:r>
+      <w:r>
+        <w:rPr>
+          <w:sz w:val="28"/>
+          <w:szCs w:val="28"/>
+        </w:rPr>
+        <w:t>sammen med modellens forudsigelser i global mean surface temperature plottet. (Det her minder teknisk meget om at plotte radiativ forcing tidsserien så det burde gå hurtigt når jeg først har filen)</w:t>
       </w:r>
       <w:r>
         <w:rPr>
@@ -108,35 +101,21 @@
           <w:sz w:val="28"/>
           <w:szCs w:val="28"/>
         </w:rPr>
-        <w:t xml:space="preserve">Der er et </w:t>
-      </w:r>
-      <w:r>
-        <w:rPr>
-          <w:sz w:val="28"/>
-          <w:szCs w:val="28"/>
-        </w:rPr>
-        <w:t>sandsynligt</w:t>
-      </w:r>
-      <w:r>
-        <w:rPr>
-          <w:sz w:val="28"/>
-          <w:szCs w:val="28"/>
-        </w:rPr>
-        <w:t xml:space="preserve"> problem med indeksering i </w:t>
-      </w:r>
-      <w:r>
-        <w:rPr>
-          <w:sz w:val="28"/>
-          <w:szCs w:val="28"/>
-        </w:rPr>
-        <w:t xml:space="preserve">simulationstemperatur arrayet fordi det indeholder kontrolår, sammenlignet med historisk temperaturarrayet der ikke indeholder kontrolår. Det skal fikses så de enten begge indeholder kontrolår eller begge ikke gør det. </w:t>
-      </w:r>
-      <w:r>
-        <w:rPr>
-          <w:sz w:val="28"/>
-          <w:szCs w:val="28"/>
-        </w:rPr>
-        <w:t xml:space="preserve">Dette problem har bl.a. at gøre med hvorvidt jeg concatenater med kontrol array når jeg importerer data fra csv. </w:t>
+        <w:t>Kode</w:t>
+      </w:r>
+      <w:r>
+        <w:rPr>
+          <w:sz w:val="28"/>
+          <w:szCs w:val="28"/>
+        </w:rPr>
+        <w:t xml:space="preserve"> der læser csv-filer i VariableForcing og Historical skal </w:t>
+      </w:r>
+      <w:r>
+        <w:rPr>
+          <w:sz w:val="28"/>
+          <w:szCs w:val="28"/>
+        </w:rPr>
+        <w:t xml:space="preserve">fjernes fra modes.py og laves til funktioner i outputs.py som kan kaldes fra modes.py. </w:t>
       </w:r>
     </w:p>
     <w:p>
@@ -167,42 +146,7 @@
           <w:sz w:val="28"/>
           <w:szCs w:val="28"/>
         </w:rPr>
-        <w:t xml:space="preserve">3. </w:t>
-      </w:r>
-      <w:r>
-        <w:rPr>
-          <w:sz w:val="28"/>
-          <w:szCs w:val="28"/>
-        </w:rPr>
-        <w:t>Sikre at VarForc</w:t>
-      </w:r>
-      <w:r>
-        <w:rPr>
-          <w:sz w:val="28"/>
-          <w:szCs w:val="28"/>
-        </w:rPr>
-        <w:t xml:space="preserve"> og Historical</w:t>
-      </w:r>
-      <w:r>
-        <w:rPr>
-          <w:sz w:val="28"/>
-          <w:szCs w:val="28"/>
-        </w:rPr>
-        <w:t xml:space="preserve"> er kompatibel med </w:t>
-      </w:r>
-      <w:r>
-        <w:rPr>
-          <w:sz w:val="28"/>
-          <w:szCs w:val="28"/>
-        </w:rPr>
-        <w:t>variable seadepth</w:t>
-      </w:r>
-      <w:r>
-        <w:rPr>
-          <w:sz w:val="28"/>
-          <w:szCs w:val="28"/>
-        </w:rPr>
-        <w:t xml:space="preserve"> og hinanden</w:t>
+        <w:t>3</w:t>
       </w:r>
       <w:r>
         <w:rPr>
@@ -260,15 +204,6 @@
         </w:rPr>
         <w:t xml:space="preserve">integreres med variable seadepth til at få den zonale temperaturprofil til at passe bedre med data. </w:t>
       </w:r>
-    </w:p>
-    <w:p>
-      <w:pPr>
-        <w:pStyle w:val="Listeafsnit"/>
-        <w:rPr>
-          <w:sz w:val="28"/>
-          <w:szCs w:val="28"/>
-        </w:rPr>
-      </w:pPr>
     </w:p>
     <w:p>
       <w:pPr>
@@ -305,7 +240,21 @@
           <w:sz w:val="28"/>
           <w:szCs w:val="28"/>
         </w:rPr>
-        <w:t>Sikre at c</w:t>
+        <w:t>Sikre</w:t>
+      </w:r>
+      <w:r>
+        <w:rPr>
+          <w:sz w:val="28"/>
+          <w:szCs w:val="28"/>
+        </w:rPr>
+        <w:t xml:space="preserve"> automatisk</w:t>
+      </w:r>
+      <w:r>
+        <w:rPr>
+          <w:sz w:val="28"/>
+          <w:szCs w:val="28"/>
+        </w:rPr>
+        <w:t xml:space="preserve"> at c</w:t>
       </w:r>
       <w:r>
         <w:rPr>
@@ -314,6 +263,23 @@
         </w:rPr>
         <w:t>trl_years er stor nok til at modellen opnår ligevægt</w:t>
       </w:r>
+      <w:r>
+        <w:rPr>
+          <w:sz w:val="28"/>
+          <w:szCs w:val="28"/>
+        </w:rPr>
+        <w:t xml:space="preserve">- Det skal gøres ved at skrive en algoritme der holder øje med forskellen i temperatur fra år til år og stopper når forskellen mellem to år er lille nok. </w:t>
+      </w:r>
+    </w:p>
+    <w:p>
+      <w:pPr>
+        <w:pStyle w:val="Listeafsnit"/>
+        <w:spacing w:line="360" w:lineRule="auto"/>
+        <w:rPr>
+          <w:sz w:val="28"/>
+          <w:szCs w:val="28"/>
+        </w:rPr>
+      </w:pPr>
     </w:p>
     <w:sectPr>
       <w:pgSz w:w="11906" w:h="16838"/>

</xml_diff>

<commit_message>
tilføjede tools.py fil med csvreader funktion, gav HistData og VarForc separate funktionaliteter, lavede ModifyOutputs class i outputs der tiføjer observeret data til default outputs
</commit_message>
<xml_diff>
--- a/to do liste klima.docx
+++ b/to do liste klima.docx
@@ -42,34 +42,40 @@
           <w:sz w:val="28"/>
           <w:szCs w:val="28"/>
         </w:rPr>
-        <w:t xml:space="preserve">1. </w:t>
-      </w:r>
-      <w:r>
-        <w:rPr>
-          <w:sz w:val="28"/>
-          <w:szCs w:val="28"/>
-        </w:rPr>
-        <w:t xml:space="preserve">Plot Eigils temperaturdata </w:t>
-      </w:r>
-      <w:r>
-        <w:rPr>
-          <w:sz w:val="28"/>
-          <w:szCs w:val="28"/>
-        </w:rPr>
-        <w:t>sammen med modellens forudsigelser i global mean surface temperature plottet. (Det her minder teknisk meget om at plotte radiativ forcing tidsserien så det burde gå hurtigt når jeg først har filen)</w:t>
-      </w:r>
-      <w:r>
-        <w:rPr>
-          <w:sz w:val="28"/>
-          <w:szCs w:val="28"/>
-        </w:rPr>
-        <w:t xml:space="preserve"> </w:t>
+        <w:t>1</w:t>
+      </w:r>
+      <w:r>
+        <w:rPr>
+          <w:sz w:val="28"/>
+          <w:szCs w:val="28"/>
+        </w:rPr>
+        <w:t xml:space="preserve">. </w:t>
+      </w:r>
+      <w:r>
+        <w:rPr>
+          <w:sz w:val="28"/>
+          <w:szCs w:val="28"/>
+        </w:rPr>
+        <w:t xml:space="preserve">Sørg for at Default Output ikke bliver tilføjet til outputs to gange af forskellige modes, når man kører med to modes. </w:t>
+      </w:r>
+      <w:r>
+        <w:rPr>
+          <w:sz w:val="28"/>
+          <w:szCs w:val="28"/>
+        </w:rPr>
+        <w:t xml:space="preserve">Find ud af hvordan ModifyOutput kan tilføje til </w:t>
+      </w:r>
+      <w:r>
+        <w:rPr>
+          <w:sz w:val="28"/>
+          <w:szCs w:val="28"/>
+        </w:rPr>
+        <w:t xml:space="preserve">summary der printes når koden kører. </w:t>
       </w:r>
     </w:p>
     <w:p>
       <w:pPr>
         <w:pStyle w:val="Listeafsnit"/>
-        <w:spacing w:line="360" w:lineRule="auto"/>
         <w:rPr>
           <w:sz w:val="28"/>
           <w:szCs w:val="28"/>
@@ -94,28 +100,28 @@
           <w:sz w:val="28"/>
           <w:szCs w:val="28"/>
         </w:rPr>
-        <w:t xml:space="preserve">2. </w:t>
-      </w:r>
-      <w:r>
-        <w:rPr>
-          <w:sz w:val="28"/>
-          <w:szCs w:val="28"/>
-        </w:rPr>
-        <w:t>Kode</w:t>
-      </w:r>
-      <w:r>
-        <w:rPr>
-          <w:sz w:val="28"/>
-          <w:szCs w:val="28"/>
-        </w:rPr>
-        <w:t xml:space="preserve"> der læser csv-filer i VariableForcing og Historical skal </w:t>
-      </w:r>
-      <w:r>
-        <w:rPr>
-          <w:sz w:val="28"/>
-          <w:szCs w:val="28"/>
-        </w:rPr>
-        <w:t xml:space="preserve">fjernes fra modes.py og laves til funktioner i outputs.py som kan kaldes fra modes.py. </w:t>
+        <w:t>2</w:t>
+      </w:r>
+      <w:r>
+        <w:rPr>
+          <w:sz w:val="28"/>
+          <w:szCs w:val="28"/>
+        </w:rPr>
+        <w:t>. Plot Eigils data for forske</w:t>
+      </w:r>
+      <w:r>
+        <w:rPr>
+          <w:sz w:val="28"/>
+          <w:szCs w:val="28"/>
+        </w:rPr>
+        <w:t>llige ting</w:t>
+      </w:r>
+      <w:r>
+        <w:rPr>
+          <w:sz w:val="28"/>
+          <w:szCs w:val="28"/>
+        </w:rPr>
+        <w:t>. kræver jeg lærer xarray</w:t>
       </w:r>
     </w:p>
     <w:p>
@@ -153,56 +159,28 @@
           <w:sz w:val="28"/>
           <w:szCs w:val="28"/>
         </w:rPr>
-        <w:t xml:space="preserve">. Finde den rigtige seadepth til specielt Historical for at få korrekte forudsigelser, hvilket nemmest kan gøres når punkt 1 er gjort. </w:t>
-      </w:r>
-      <w:r>
-        <w:rPr>
-          <w:sz w:val="28"/>
-          <w:szCs w:val="28"/>
-        </w:rPr>
-        <w:t>For Historical giver det måske mening at påtvinge 250 m da det giver</w:t>
-      </w:r>
-      <w:r>
-        <w:rPr>
-          <w:sz w:val="28"/>
-          <w:szCs w:val="28"/>
-        </w:rPr>
-        <w:t xml:space="preserve"> cirka</w:t>
-      </w:r>
-      <w:r>
-        <w:rPr>
-          <w:sz w:val="28"/>
-          <w:szCs w:val="28"/>
-        </w:rPr>
-        <w:t xml:space="preserve"> den rigtige temperaturstigning</w:t>
-      </w:r>
-      <w:r>
-        <w:rPr>
-          <w:sz w:val="28"/>
-          <w:szCs w:val="28"/>
-        </w:rPr>
-        <w:t xml:space="preserve"> i 2024</w:t>
-      </w:r>
-      <w:r>
-        <w:rPr>
-          <w:sz w:val="28"/>
-          <w:szCs w:val="28"/>
-        </w:rPr>
-        <w:t xml:space="preserve">, men det </w:t>
-      </w:r>
-      <w:r>
-        <w:rPr>
-          <w:sz w:val="28"/>
-          <w:szCs w:val="28"/>
-        </w:rPr>
-        <w:t xml:space="preserve">skal </w:t>
-      </w:r>
-      <w:r>
-        <w:rPr>
-          <w:sz w:val="28"/>
-          <w:szCs w:val="28"/>
-        </w:rPr>
-        <w:t xml:space="preserve">integreres med variable seadepth til at få den zonale temperaturprofil til at passe bedre med data. </w:t>
+        <w:t xml:space="preserve">. Finde den rigtige seadepth til </w:t>
+      </w:r>
+      <w:r>
+        <w:rPr>
+          <w:sz w:val="28"/>
+          <w:szCs w:val="28"/>
+        </w:rPr>
+        <w:t>Variable Forcing med historiske forcingdata. Dette kan gøres ved at tune mod den observerede temperatur</w:t>
+      </w:r>
+      <w:r>
+        <w:rPr>
+          <w:sz w:val="28"/>
+          <w:szCs w:val="28"/>
+        </w:rPr>
+        <w:t xml:space="preserve"> over tid når de data er plottet.</w:t>
+      </w:r>
+      <w:r>
+        <w:rPr>
+          <w:sz w:val="28"/>
+          <w:szCs w:val="28"/>
+        </w:rPr>
+        <w:t xml:space="preserve"> </w:t>
       </w:r>
     </w:p>
     <w:p>
@@ -269,6 +247,36 @@
           <w:szCs w:val="28"/>
         </w:rPr>
         <w:t xml:space="preserve">- Det skal gøres ved at skrive en algoritme der holder øje med forskellen i temperatur fra år til år og stopper når forskellen mellem to år er lille nok. </w:t>
+      </w:r>
+    </w:p>
+    <w:p>
+      <w:pPr>
+        <w:pStyle w:val="Listeafsnit"/>
+        <w:rPr>
+          <w:sz w:val="28"/>
+          <w:szCs w:val="28"/>
+        </w:rPr>
+      </w:pPr>
+    </w:p>
+    <w:p>
+      <w:pPr>
+        <w:pStyle w:val="Listeafsnit"/>
+        <w:numPr>
+          <w:ilvl w:val="0"/>
+          <w:numId w:val="1"/>
+        </w:numPr>
+        <w:spacing w:line="360" w:lineRule="auto"/>
+        <w:rPr>
+          <w:sz w:val="28"/>
+          <w:szCs w:val="28"/>
+        </w:rPr>
+      </w:pPr>
+      <w:r>
+        <w:rPr>
+          <w:sz w:val="28"/>
+          <w:szCs w:val="28"/>
+        </w:rPr>
+        <w:t>5. lave et if statement til om header text skal skippes når csv filer læses</w:t>
       </w:r>
     </w:p>
     <w:p>

</xml_diff>

<commit_message>
tilføjede netcdf reader funktion i tools, tilføjede temp_history i config og datafilen i datafil mappen
</commit_message>
<xml_diff>
--- a/to do liste klima.docx
+++ b/to do liste klima.docx
@@ -123,6 +123,13 @@
         </w:rPr>
         <w:t>. kræver jeg lærer xarray</w:t>
       </w:r>
+      <w:r>
+        <w:rPr>
+          <w:sz w:val="28"/>
+          <w:szCs w:val="28"/>
+        </w:rPr>
+        <w:t xml:space="preserve">. Problemer med scipy lige nu, prøv måske netcdf eller spørg chatgpt om fejlen. </w:t>
+      </w:r>
     </w:p>
     <w:p>
       <w:pPr>
@@ -277,6 +284,95 @@
           <w:szCs w:val="28"/>
         </w:rPr>
         <w:t>5. lave et if statement til om header text skal skippes når csv filer læses</w:t>
+      </w:r>
+    </w:p>
+    <w:p>
+      <w:pPr>
+        <w:pStyle w:val="Listeafsnit"/>
+        <w:rPr>
+          <w:sz w:val="28"/>
+          <w:szCs w:val="28"/>
+        </w:rPr>
+      </w:pPr>
+    </w:p>
+    <w:p>
+      <w:pPr>
+        <w:spacing w:line="360" w:lineRule="auto"/>
+        <w:rPr>
+          <w:b/>
+          <w:bCs/>
+          <w:sz w:val="28"/>
+          <w:szCs w:val="28"/>
+        </w:rPr>
+      </w:pPr>
+      <w:r>
+        <w:rPr>
+          <w:b/>
+          <w:bCs/>
+          <w:sz w:val="28"/>
+          <w:szCs w:val="28"/>
+        </w:rPr>
+        <w:t>Spørgsmål til Johan</w:t>
+      </w:r>
+    </w:p>
+    <w:p>
+      <w:pPr>
+        <w:spacing w:line="360" w:lineRule="auto"/>
+        <w:rPr>
+          <w:sz w:val="28"/>
+          <w:szCs w:val="28"/>
+        </w:rPr>
+      </w:pPr>
+      <w:r>
+        <w:rPr>
+          <w:sz w:val="28"/>
+          <w:szCs w:val="28"/>
+        </w:rPr>
+        <w:t xml:space="preserve">Hvorfor skal vi bruge </w:t>
+      </w:r>
+      <w:r>
+        <w:rPr>
+          <w:sz w:val="28"/>
+          <w:szCs w:val="28"/>
+        </w:rPr>
+        <w:t xml:space="preserve">config listen i linje 42 i main til at læse </w:t>
+      </w:r>
+      <w:r>
+        <w:rPr>
+          <w:sz w:val="28"/>
+          <w:szCs w:val="28"/>
+        </w:rPr>
+        <w:t>datafiler</w:t>
+      </w:r>
+      <w:r>
+        <w:rPr>
+          <w:sz w:val="28"/>
+          <w:szCs w:val="28"/>
+        </w:rPr>
+        <w:t>?</w:t>
+      </w:r>
+    </w:p>
+    <w:p>
+      <w:pPr>
+        <w:spacing w:line="360" w:lineRule="auto"/>
+        <w:rPr>
+          <w:sz w:val="28"/>
+          <w:szCs w:val="28"/>
+        </w:rPr>
+      </w:pPr>
+      <w:r>
+        <w:rPr>
+          <w:sz w:val="28"/>
+          <w:szCs w:val="28"/>
+        </w:rPr>
+        <w:t xml:space="preserve">Hvorfor er der et if statement med forcing_data i linje </w:t>
+      </w:r>
+      <w:r>
+        <w:rPr>
+          <w:sz w:val="28"/>
+          <w:szCs w:val="28"/>
+        </w:rPr>
+        <w:t xml:space="preserve">79 i modes? </w:t>
       </w:r>
     </w:p>
     <w:p>

</xml_diff>

<commit_message>
changed modes.warn to tools.warn in code
</commit_message>
<xml_diff>
--- a/to do liste klima.docx
+++ b/to do liste klima.docx
@@ -107,28 +107,77 @@
           <w:sz w:val="28"/>
           <w:szCs w:val="28"/>
         </w:rPr>
-        <w:t>. Plot Eigils data for forske</w:t>
-      </w:r>
-      <w:r>
-        <w:rPr>
-          <w:sz w:val="28"/>
-          <w:szCs w:val="28"/>
-        </w:rPr>
-        <w:t>llige ting</w:t>
-      </w:r>
-      <w:r>
-        <w:rPr>
-          <w:sz w:val="28"/>
-          <w:szCs w:val="28"/>
-        </w:rPr>
-        <w:t>. kræver jeg lærer xarray</w:t>
-      </w:r>
-      <w:r>
-        <w:rPr>
-          <w:sz w:val="28"/>
-          <w:szCs w:val="28"/>
-        </w:rPr>
-        <w:t xml:space="preserve">. Problemer med scipy lige nu, prøv måske netcdf eller spørg chatgpt om fejlen. </w:t>
+        <w:t xml:space="preserve">. Plot Eigils data </w:t>
+      </w:r>
+      <w:r>
+        <w:rPr>
+          <w:sz w:val="28"/>
+          <w:szCs w:val="28"/>
+        </w:rPr>
+        <w:t>for OLR på OLR-plottet og solar-in og shortwave-out på albedo plottet.</w:t>
+      </w:r>
+      <w:r>
+        <w:rPr>
+          <w:sz w:val="28"/>
+          <w:szCs w:val="28"/>
+        </w:rPr>
+        <w:t xml:space="preserve"> </w:t>
+      </w:r>
+      <w:r>
+        <w:rPr>
+          <w:sz w:val="28"/>
+          <w:szCs w:val="28"/>
+        </w:rPr>
+        <w:t xml:space="preserve">Temperaturhistorien </w:t>
+      </w:r>
+      <w:r>
+        <w:rPr>
+          <w:sz w:val="28"/>
+          <w:szCs w:val="28"/>
+        </w:rPr>
+        <w:t>kræver jeg lærer xarray</w:t>
+      </w:r>
+      <w:r>
+        <w:rPr>
+          <w:sz w:val="28"/>
+          <w:szCs w:val="28"/>
+        </w:rPr>
+        <w:t xml:space="preserve">. Problemer med </w:t>
+      </w:r>
+      <w:r>
+        <w:rPr>
+          <w:sz w:val="28"/>
+          <w:szCs w:val="28"/>
+        </w:rPr>
+        <w:t xml:space="preserve">at indlæse </w:t>
+      </w:r>
+      <w:r>
+        <w:rPr>
+          <w:sz w:val="28"/>
+          <w:szCs w:val="28"/>
+        </w:rPr>
+        <w:t xml:space="preserve">netcdf med </w:t>
+      </w:r>
+      <w:r>
+        <w:rPr>
+          <w:sz w:val="28"/>
+          <w:szCs w:val="28"/>
+        </w:rPr>
+        <w:t>scipy lige nu, prøv måske netcdf</w:t>
+      </w:r>
+      <w:r>
+        <w:rPr>
+          <w:sz w:val="28"/>
+          <w:szCs w:val="28"/>
+        </w:rPr>
+        <w:t>4 læseren</w:t>
+      </w:r>
+      <w:r>
+        <w:rPr>
+          <w:sz w:val="28"/>
+          <w:szCs w:val="28"/>
+        </w:rPr>
+        <w:t xml:space="preserve"> eller spørg chatgpt om fejlen. </w:t>
       </w:r>
     </w:p>
     <w:p>
@@ -283,7 +332,14 @@
           <w:sz w:val="28"/>
           <w:szCs w:val="28"/>
         </w:rPr>
-        <w:t>5. lave et if statement til om header text skal skippes når csv filer læses</w:t>
+        <w:t xml:space="preserve">5. </w:t>
+      </w:r>
+      <w:r>
+        <w:rPr>
+          <w:sz w:val="28"/>
+          <w:szCs w:val="28"/>
+        </w:rPr>
+        <w:t xml:space="preserve">læs main.py og outputs.py grundigt igennem. Stil Johan spørgsmål om dem hvis du har nogen. </w:t>
       </w:r>
     </w:p>
     <w:p>
@@ -377,13 +433,19 @@
     </w:p>
     <w:p>
       <w:pPr>
-        <w:pStyle w:val="Listeafsnit"/>
         <w:spacing w:line="360" w:lineRule="auto"/>
         <w:rPr>
           <w:sz w:val="28"/>
           <w:szCs w:val="28"/>
         </w:rPr>
       </w:pPr>
+      <w:r>
+        <w:rPr>
+          <w:sz w:val="28"/>
+          <w:szCs w:val="28"/>
+        </w:rPr>
+        <w:t>Hvad skal alle listerne i DefaultOutput.finalize() bruges til?</w:t>
+      </w:r>
     </w:p>
     <w:sectPr>
       <w:pgSz w:w="11906" w:h="16838"/>

</xml_diff>

<commit_message>
added more observed data to outputs in HistData mode. made csv reading code more compact
</commit_message>
<xml_diff>
--- a/to do liste klima.docx
+++ b/to do liste klima.docx
@@ -56,13 +56,6 @@
           <w:sz w:val="28"/>
           <w:szCs w:val="28"/>
         </w:rPr>
-        <w:t xml:space="preserve">Sørg for at Default Output ikke bliver tilføjet til outputs to gange af forskellige modes, når man kører med to modes. </w:t>
-      </w:r>
-      <w:r>
-        <w:rPr>
-          <w:sz w:val="28"/>
-          <w:szCs w:val="28"/>
-        </w:rPr>
         <w:t xml:space="preserve">Find ud af hvordan ModifyOutput kan tilføje til </w:t>
       </w:r>
       <w:r>
@@ -114,21 +107,28 @@
           <w:sz w:val="28"/>
           <w:szCs w:val="28"/>
         </w:rPr>
-        <w:t>for OLR på OLR-plottet og solar-in og shortwave-out på albedo plottet.</w:t>
-      </w:r>
-      <w:r>
-        <w:rPr>
-          <w:sz w:val="28"/>
-          <w:szCs w:val="28"/>
-        </w:rPr>
-        <w:t xml:space="preserve"> </w:t>
-      </w:r>
-      <w:r>
-        <w:rPr>
-          <w:sz w:val="28"/>
-          <w:szCs w:val="28"/>
-        </w:rPr>
-        <w:t xml:space="preserve">Temperaturhistorien </w:t>
+        <w:t>for</w:t>
+      </w:r>
+      <w:r>
+        <w:rPr>
+          <w:sz w:val="28"/>
+          <w:szCs w:val="28"/>
+        </w:rPr>
+        <w:t xml:space="preserve"> t</w:t>
+      </w:r>
+      <w:r>
+        <w:rPr>
+          <w:sz w:val="28"/>
+          <w:szCs w:val="28"/>
+        </w:rPr>
+        <w:t>emperaturhistorien</w:t>
+      </w:r>
+      <w:r>
+        <w:rPr>
+          <w:sz w:val="28"/>
+          <w:szCs w:val="28"/>
+        </w:rPr>
+        <w:t xml:space="preserve">. Det </w:t>
       </w:r>
       <w:r>
         <w:rPr>
@@ -445,6 +445,13 @@
           <w:szCs w:val="28"/>
         </w:rPr>
         <w:t>Hvad skal alle listerne i DefaultOutput.finalize() bruges til?</w:t>
+      </w:r>
+      <w:r>
+        <w:rPr>
+          <w:sz w:val="28"/>
+          <w:szCs w:val="28"/>
+        </w:rPr>
+        <w:t xml:space="preserve"> Og listerne i main</w:t>
       </w:r>
     </w:p>
     <w:sectPr>

</xml_diff>

<commit_message>
fixed bug in netcdf reader and added code in outputs that reads netcdf file
</commit_message>
<xml_diff>
--- a/to do liste klima.docx
+++ b/to do liste klima.docx
@@ -65,6 +65,27 @@
         </w:rPr>
         <w:t xml:space="preserve">summary der printes når koden kører. </w:t>
       </w:r>
+      <w:r>
+        <w:rPr>
+          <w:sz w:val="28"/>
+          <w:szCs w:val="28"/>
+        </w:rPr>
+        <w:t xml:space="preserve">Lav et for loop der samler </w:t>
+      </w:r>
+      <w:r>
+        <w:rPr>
+          <w:sz w:val="28"/>
+          <w:szCs w:val="28"/>
+        </w:rPr>
+        <w:t xml:space="preserve">de forskellige </w:t>
+      </w:r>
+      <w:r>
+        <w:rPr>
+          <w:sz w:val="28"/>
+          <w:szCs w:val="28"/>
+        </w:rPr>
+        <w:t xml:space="preserve">data i ModifyOutputs. </w:t>
+      </w:r>
     </w:p>
     <w:p>
       <w:pPr>
@@ -163,7 +184,35 @@
           <w:sz w:val="28"/>
           <w:szCs w:val="28"/>
         </w:rPr>
-        <w:t>scipy lige nu, prøv måske netcdf</w:t>
+        <w:t>scipy lige nu</w:t>
+      </w:r>
+      <w:r>
+        <w:rPr>
+          <w:sz w:val="28"/>
+          <w:szCs w:val="28"/>
+        </w:rPr>
+        <w:t>.</w:t>
+      </w:r>
+      <w:r>
+        <w:rPr>
+          <w:sz w:val="28"/>
+          <w:szCs w:val="28"/>
+        </w:rPr>
+        <w:t xml:space="preserve"> </w:t>
+      </w:r>
+      <w:r>
+        <w:rPr>
+          <w:sz w:val="28"/>
+          <w:szCs w:val="28"/>
+        </w:rPr>
+        <w:t>P</w:t>
+      </w:r>
+      <w:r>
+        <w:rPr>
+          <w:sz w:val="28"/>
+          <w:szCs w:val="28"/>
+        </w:rPr>
+        <w:t>røv måske netcdf</w:t>
       </w:r>
       <w:r>
         <w:rPr>

</xml_diff>

<commit_message>
tilføjede HistoricalOutput som aktiveres af HistData mode og plotter den observerede temperaturtidsserie fra GISS
</commit_message>
<xml_diff>
--- a/to do liste klima.docx
+++ b/to do liste klima.docx
@@ -21,7 +21,27 @@
           <w:szCs w:val="32"/>
           <w:lang w:val="en-GB"/>
         </w:rPr>
-        <w:t>Klima job to do liste</w:t>
+        <w:t>Klima</w:t>
+      </w:r>
+      <w:r>
+        <w:rPr>
+          <w:b/>
+          <w:bCs/>
+          <w:sz w:val="32"/>
+          <w:szCs w:val="32"/>
+          <w:lang w:val="en-GB"/>
+        </w:rPr>
+        <w:t xml:space="preserve">kode </w:t>
+      </w:r>
+      <w:r>
+        <w:rPr>
+          <w:b/>
+          <w:bCs/>
+          <w:sz w:val="32"/>
+          <w:szCs w:val="32"/>
+          <w:lang w:val="en-GB"/>
+        </w:rPr>
+        <w:t>to do liste</w:t>
       </w:r>
     </w:p>
     <w:p>
@@ -56,35 +76,49 @@
           <w:sz w:val="28"/>
           <w:szCs w:val="28"/>
         </w:rPr>
-        <w:t xml:space="preserve">Find ud af hvordan ModifyOutput kan tilføje til </w:t>
-      </w:r>
-      <w:r>
-        <w:rPr>
-          <w:sz w:val="28"/>
-          <w:szCs w:val="28"/>
-        </w:rPr>
-        <w:t xml:space="preserve">summary der printes når koden kører. </w:t>
-      </w:r>
-      <w:r>
-        <w:rPr>
-          <w:sz w:val="28"/>
-          <w:szCs w:val="28"/>
-        </w:rPr>
-        <w:t xml:space="preserve">Lav et for loop der samler </w:t>
-      </w:r>
-      <w:r>
-        <w:rPr>
-          <w:sz w:val="28"/>
-          <w:szCs w:val="28"/>
-        </w:rPr>
-        <w:t xml:space="preserve">de forskellige </w:t>
-      </w:r>
-      <w:r>
-        <w:rPr>
-          <w:sz w:val="28"/>
-          <w:szCs w:val="28"/>
-        </w:rPr>
-        <w:t xml:space="preserve">data i ModifyOutputs. </w:t>
+        <w:t>Fi</w:t>
+      </w:r>
+      <w:r>
+        <w:rPr>
+          <w:sz w:val="28"/>
+          <w:szCs w:val="28"/>
+        </w:rPr>
+        <w:t xml:space="preserve">kse </w:t>
+      </w:r>
+      <w:r>
+        <w:rPr>
+          <w:sz w:val="28"/>
+          <w:szCs w:val="28"/>
+        </w:rPr>
+        <w:t>self</w:t>
+      </w:r>
+      <w:r>
+        <w:rPr>
+          <w:sz w:val="28"/>
+          <w:szCs w:val="28"/>
+        </w:rPr>
+        <w:t xml:space="preserve">.start_year </w:t>
+      </w:r>
+      <w:r>
+        <w:rPr>
+          <w:sz w:val="28"/>
+          <w:szCs w:val="28"/>
+        </w:rPr>
+        <w:t>hardcoding</w:t>
+      </w:r>
+      <w:r>
+        <w:rPr>
+          <w:sz w:val="28"/>
+          <w:szCs w:val="28"/>
+        </w:rPr>
+        <w:t xml:space="preserve"> i HistoricalOutput og tjekke om self.ctrl_years i VariableForcingOutput er overflødigt. </w:t>
+      </w:r>
+      <w:r>
+        <w:rPr>
+          <w:sz w:val="28"/>
+          <w:szCs w:val="28"/>
+        </w:rPr>
+        <w:t xml:space="preserve"> </w:t>
       </w:r>
     </w:p>
     <w:p>
@@ -107,126 +141,40 @@
         <w:rPr>
           <w:sz w:val="28"/>
           <w:szCs w:val="28"/>
-        </w:rPr>
-      </w:pPr>
-      <w:r>
-        <w:rPr>
-          <w:sz w:val="28"/>
-          <w:szCs w:val="28"/>
-        </w:rPr>
-        <w:t>2</w:t>
-      </w:r>
-      <w:r>
-        <w:rPr>
-          <w:sz w:val="28"/>
-          <w:szCs w:val="28"/>
-        </w:rPr>
-        <w:t xml:space="preserve">. Plot Eigils data </w:t>
-      </w:r>
-      <w:r>
-        <w:rPr>
-          <w:sz w:val="28"/>
-          <w:szCs w:val="28"/>
-        </w:rPr>
-        <w:t>for</w:t>
-      </w:r>
-      <w:r>
-        <w:rPr>
-          <w:sz w:val="28"/>
-          <w:szCs w:val="28"/>
-        </w:rPr>
-        <w:t xml:space="preserve"> t</w:t>
-      </w:r>
-      <w:r>
-        <w:rPr>
-          <w:sz w:val="28"/>
-          <w:szCs w:val="28"/>
-        </w:rPr>
-        <w:t>emperaturhistorien</w:t>
-      </w:r>
-      <w:r>
-        <w:rPr>
-          <w:sz w:val="28"/>
-          <w:szCs w:val="28"/>
-        </w:rPr>
-        <w:t xml:space="preserve">. Det </w:t>
-      </w:r>
-      <w:r>
-        <w:rPr>
-          <w:sz w:val="28"/>
-          <w:szCs w:val="28"/>
-        </w:rPr>
-        <w:t>kræver jeg lærer xarray</w:t>
-      </w:r>
-      <w:r>
-        <w:rPr>
-          <w:sz w:val="28"/>
-          <w:szCs w:val="28"/>
-        </w:rPr>
-        <w:t xml:space="preserve">. Problemer med </w:t>
-      </w:r>
-      <w:r>
-        <w:rPr>
-          <w:sz w:val="28"/>
-          <w:szCs w:val="28"/>
-        </w:rPr>
-        <w:t xml:space="preserve">at indlæse </w:t>
-      </w:r>
-      <w:r>
-        <w:rPr>
-          <w:sz w:val="28"/>
-          <w:szCs w:val="28"/>
-        </w:rPr>
-        <w:t xml:space="preserve">netcdf med </w:t>
-      </w:r>
-      <w:r>
-        <w:rPr>
-          <w:sz w:val="28"/>
-          <w:szCs w:val="28"/>
-        </w:rPr>
-        <w:t>scipy lige nu</w:t>
-      </w:r>
-      <w:r>
-        <w:rPr>
-          <w:sz w:val="28"/>
-          <w:szCs w:val="28"/>
-        </w:rPr>
-        <w:t>.</w:t>
-      </w:r>
-      <w:r>
-        <w:rPr>
-          <w:sz w:val="28"/>
-          <w:szCs w:val="28"/>
-        </w:rPr>
-        <w:t xml:space="preserve"> </w:t>
-      </w:r>
-      <w:r>
-        <w:rPr>
-          <w:sz w:val="28"/>
-          <w:szCs w:val="28"/>
-        </w:rPr>
-        <w:t>P</w:t>
-      </w:r>
-      <w:r>
-        <w:rPr>
-          <w:sz w:val="28"/>
-          <w:szCs w:val="28"/>
-        </w:rPr>
-        <w:t>røv måske netcdf</w:t>
-      </w:r>
-      <w:r>
-        <w:rPr>
-          <w:sz w:val="28"/>
-          <w:szCs w:val="28"/>
-        </w:rPr>
-        <w:t>4 læseren</w:t>
-      </w:r>
-      <w:r>
-        <w:rPr>
-          <w:sz w:val="28"/>
-          <w:szCs w:val="28"/>
-        </w:rPr>
-        <w:t xml:space="preserve"> eller spørg chatgpt om fejlen. </w:t>
+          <w:lang w:val="en-GB"/>
+        </w:rPr>
+      </w:pPr>
+      <w:r>
+        <w:rPr>
+          <w:sz w:val="28"/>
+          <w:szCs w:val="28"/>
+          <w:lang w:val="en-GB"/>
+        </w:rPr>
+        <w:t xml:space="preserve">2. </w:t>
+      </w:r>
+      <w:r>
+        <w:rPr>
+          <w:sz w:val="28"/>
+          <w:szCs w:val="28"/>
+          <w:lang w:val="en-GB"/>
+        </w:rPr>
+        <w:t xml:space="preserve">Fjerne hardcoding i HistoricalOutput --&gt; panel </w:t>
+      </w:r>
+      <w:r>
+        <w:rPr>
+          <w:sz w:val="28"/>
+          <w:szCs w:val="28"/>
+          <w:lang w:val="en-GB"/>
+        </w:rPr>
+        <w:t>--&gt; a</w:t>
+      </w:r>
+      <w:r>
+        <w:rPr>
+          <w:sz w:val="28"/>
+          <w:szCs w:val="28"/>
+          <w:lang w:val="en-GB"/>
+        </w:rPr>
+        <w:t>x.set_ylim()</w:t>
       </w:r>
     </w:p>
     <w:p>
@@ -236,6 +184,7 @@
         <w:rPr>
           <w:sz w:val="28"/>
           <w:szCs w:val="28"/>
+          <w:lang w:val="en-GB"/>
         </w:rPr>
       </w:pPr>
     </w:p>
@@ -271,7 +220,7 @@
           <w:sz w:val="28"/>
           <w:szCs w:val="28"/>
         </w:rPr>
-        <w:t>Variable Forcing med historiske forcingdata. Dette kan gøres ved at tune mod den observerede temperatur</w:t>
+        <w:t>VarForc med historiske forcingdata. Dette kan gøres ved at tune mod den observerede temperatur</w:t>
       </w:r>
       <w:r>
         <w:rPr>
@@ -291,7 +240,6 @@
     <w:p>
       <w:pPr>
         <w:pStyle w:val="Listeafsnit"/>
-        <w:spacing w:line="360" w:lineRule="auto"/>
         <w:rPr>
           <w:sz w:val="28"/>
           <w:szCs w:val="28"/>
@@ -316,47 +264,34 @@
           <w:sz w:val="28"/>
           <w:szCs w:val="28"/>
         </w:rPr>
-        <w:t xml:space="preserve">4. </w:t>
-      </w:r>
-      <w:r>
-        <w:rPr>
-          <w:sz w:val="28"/>
-          <w:szCs w:val="28"/>
-        </w:rPr>
-        <w:t>Sikre</w:t>
-      </w:r>
-      <w:r>
-        <w:rPr>
-          <w:sz w:val="28"/>
-          <w:szCs w:val="28"/>
-        </w:rPr>
-        <w:t xml:space="preserve"> automatisk</w:t>
-      </w:r>
-      <w:r>
-        <w:rPr>
-          <w:sz w:val="28"/>
-          <w:szCs w:val="28"/>
-        </w:rPr>
-        <w:t xml:space="preserve"> at c</w:t>
-      </w:r>
-      <w:r>
-        <w:rPr>
-          <w:sz w:val="28"/>
-          <w:szCs w:val="28"/>
-        </w:rPr>
-        <w:t>trl_years er stor nok til at modellen opnår ligevægt</w:t>
-      </w:r>
-      <w:r>
-        <w:rPr>
-          <w:sz w:val="28"/>
-          <w:szCs w:val="28"/>
-        </w:rPr>
-        <w:t xml:space="preserve">- Det skal gøres ved at skrive en algoritme der holder øje med forskellen i temperatur fra år til år og stopper når forskellen mellem to år er lille nok. </w:t>
+        <w:t xml:space="preserve">4. Indlæse land-sea-mask data til brug i </w:t>
+      </w:r>
+      <w:r>
+        <w:rPr>
+          <w:sz w:val="28"/>
+          <w:szCs w:val="28"/>
+        </w:rPr>
+        <w:t>Sea</w:t>
+      </w:r>
+      <w:r>
+        <w:rPr>
+          <w:sz w:val="28"/>
+          <w:szCs w:val="28"/>
+        </w:rPr>
+        <w:t>Dep</w:t>
+      </w:r>
+      <w:r>
+        <w:rPr>
+          <w:sz w:val="28"/>
+          <w:szCs w:val="28"/>
+        </w:rPr>
+        <w:t>-moden.</w:t>
       </w:r>
     </w:p>
     <w:p>
       <w:pPr>
         <w:pStyle w:val="Listeafsnit"/>
+        <w:spacing w:line="360" w:lineRule="auto"/>
         <w:rPr>
           <w:sz w:val="28"/>
           <w:szCs w:val="28"/>
@@ -381,7 +316,86 @@
           <w:sz w:val="28"/>
           <w:szCs w:val="28"/>
         </w:rPr>
-        <w:t xml:space="preserve">5. </w:t>
+        <w:t>5</w:t>
+      </w:r>
+      <w:r>
+        <w:rPr>
+          <w:sz w:val="28"/>
+          <w:szCs w:val="28"/>
+        </w:rPr>
+        <w:t xml:space="preserve">. </w:t>
+      </w:r>
+      <w:r>
+        <w:rPr>
+          <w:sz w:val="28"/>
+          <w:szCs w:val="28"/>
+        </w:rPr>
+        <w:t>Sikre</w:t>
+      </w:r>
+      <w:r>
+        <w:rPr>
+          <w:sz w:val="28"/>
+          <w:szCs w:val="28"/>
+        </w:rPr>
+        <w:t xml:space="preserve"> automatisk</w:t>
+      </w:r>
+      <w:r>
+        <w:rPr>
+          <w:sz w:val="28"/>
+          <w:szCs w:val="28"/>
+        </w:rPr>
+        <w:t xml:space="preserve"> at c</w:t>
+      </w:r>
+      <w:r>
+        <w:rPr>
+          <w:sz w:val="28"/>
+          <w:szCs w:val="28"/>
+        </w:rPr>
+        <w:t>trl_years er stor nok til at modellen opnår ligevægt</w:t>
+      </w:r>
+      <w:r>
+        <w:rPr>
+          <w:sz w:val="28"/>
+          <w:szCs w:val="28"/>
+        </w:rPr>
+        <w:t xml:space="preserve">- Det skal gøres ved at skrive en algoritme der holder øje med forskellen i temperatur fra år til år og stopper når forskellen mellem to år er lille nok. </w:t>
+      </w:r>
+    </w:p>
+    <w:p>
+      <w:pPr>
+        <w:pStyle w:val="Listeafsnit"/>
+        <w:rPr>
+          <w:sz w:val="28"/>
+          <w:szCs w:val="28"/>
+        </w:rPr>
+      </w:pPr>
+    </w:p>
+    <w:p>
+      <w:pPr>
+        <w:pStyle w:val="Listeafsnit"/>
+        <w:numPr>
+          <w:ilvl w:val="0"/>
+          <w:numId w:val="1"/>
+        </w:numPr>
+        <w:spacing w:line="360" w:lineRule="auto"/>
+        <w:rPr>
+          <w:sz w:val="28"/>
+          <w:szCs w:val="28"/>
+        </w:rPr>
+      </w:pPr>
+      <w:r>
+        <w:rPr>
+          <w:sz w:val="28"/>
+          <w:szCs w:val="28"/>
+        </w:rPr>
+        <w:t>6</w:t>
+      </w:r>
+      <w:r>
+        <w:rPr>
+          <w:sz w:val="28"/>
+          <w:szCs w:val="28"/>
+        </w:rPr>
+        <w:t xml:space="preserve">. </w:t>
       </w:r>
       <w:r>
         <w:rPr>
@@ -389,6 +403,66 @@
           <w:szCs w:val="28"/>
         </w:rPr>
         <w:t xml:space="preserve">læs main.py og outputs.py grundigt igennem. Stil Johan spørgsmål om dem hvis du har nogen. </w:t>
+      </w:r>
+    </w:p>
+    <w:p>
+      <w:pPr>
+        <w:pStyle w:val="Listeafsnit"/>
+        <w:rPr>
+          <w:sz w:val="28"/>
+          <w:szCs w:val="28"/>
+        </w:rPr>
+      </w:pPr>
+    </w:p>
+    <w:p>
+      <w:pPr>
+        <w:pStyle w:val="Listeafsnit"/>
+        <w:numPr>
+          <w:ilvl w:val="0"/>
+          <w:numId w:val="1"/>
+        </w:numPr>
+        <w:spacing w:line="360" w:lineRule="auto"/>
+        <w:rPr>
+          <w:sz w:val="28"/>
+          <w:szCs w:val="28"/>
+        </w:rPr>
+      </w:pPr>
+      <w:r>
+        <w:rPr>
+          <w:sz w:val="28"/>
+          <w:szCs w:val="28"/>
+        </w:rPr>
+        <w:t>7. æstetiske forbedringer på tidsserie-plottet</w:t>
+      </w:r>
+    </w:p>
+    <w:p>
+      <w:pPr>
+        <w:pStyle w:val="Listeafsnit"/>
+        <w:rPr>
+          <w:sz w:val="28"/>
+          <w:szCs w:val="28"/>
+        </w:rPr>
+      </w:pPr>
+    </w:p>
+    <w:p>
+      <w:pPr>
+        <w:pStyle w:val="Listeafsnit"/>
+        <w:numPr>
+          <w:ilvl w:val="0"/>
+          <w:numId w:val="1"/>
+        </w:numPr>
+        <w:spacing w:line="360" w:lineRule="auto"/>
+        <w:rPr>
+          <w:sz w:val="28"/>
+          <w:szCs w:val="28"/>
+        </w:rPr>
+      </w:pPr>
+      <w:r>
+        <w:rPr>
+          <w:sz w:val="28"/>
+          <w:szCs w:val="28"/>
+        </w:rPr>
+        <w:t>8. Find ud af hvordan ModifyOutput kan tilføje til summary der printes når koden kører. Lav et for loop der samler de forskellige data i ModifyOutputs da det er den samme funktionalitet der bruges på de forskellige data.</w:t>
       </w:r>
     </w:p>
     <w:p>
@@ -470,6 +544,7 @@
           <w:sz w:val="28"/>
           <w:szCs w:val="28"/>
         </w:rPr>
+        <w:lastRenderedPageBreak/>
         <w:t xml:space="preserve">Hvorfor er der et if statement med forcing_data i linje </w:t>
       </w:r>
       <w:r>

</xml_diff>

<commit_message>
fjernede overflødig kode i VarForc output
</commit_message>
<xml_diff>
--- a/to do liste klima.docx
+++ b/to do liste klima.docx
@@ -111,14 +111,7 @@
           <w:sz w:val="28"/>
           <w:szCs w:val="28"/>
         </w:rPr>
-        <w:t xml:space="preserve"> i HistoricalOutput og tjekke om self.ctrl_years i VariableForcingOutput er overflødigt. </w:t>
-      </w:r>
-      <w:r>
-        <w:rPr>
-          <w:sz w:val="28"/>
-          <w:szCs w:val="28"/>
-        </w:rPr>
-        <w:t xml:space="preserve"> </w:t>
+        <w:t xml:space="preserve"> i HistoricalOutput</w:t>
       </w:r>
     </w:p>
     <w:p>
@@ -213,28 +206,14 @@
           <w:sz w:val="28"/>
           <w:szCs w:val="28"/>
         </w:rPr>
-        <w:t xml:space="preserve">. Finde den rigtige seadepth til </w:t>
-      </w:r>
-      <w:r>
-        <w:rPr>
-          <w:sz w:val="28"/>
-          <w:szCs w:val="28"/>
-        </w:rPr>
-        <w:t>VarForc med historiske forcingdata. Dette kan gøres ved at tune mod den observerede temperatur</w:t>
-      </w:r>
-      <w:r>
-        <w:rPr>
-          <w:sz w:val="28"/>
-          <w:szCs w:val="28"/>
-        </w:rPr>
-        <w:t xml:space="preserve"> over tid når de data er plottet.</w:t>
-      </w:r>
-      <w:r>
-        <w:rPr>
-          <w:sz w:val="28"/>
-          <w:szCs w:val="28"/>
-        </w:rPr>
-        <w:t xml:space="preserve"> </w:t>
+        <w:t xml:space="preserve">. </w:t>
+      </w:r>
+      <w:r>
+        <w:rPr>
+          <w:sz w:val="28"/>
+          <w:szCs w:val="28"/>
+        </w:rPr>
+        <w:t>Find ud af hvordan ModifyOutput kan tilføje til summary der printes når koden kører. Lav et for loop der samler de forskellige data i ModifyOutputs da det er den samme funktionalitet der bruges på de forskellige data.</w:t>
       </w:r>
     </w:p>
     <w:p>
@@ -462,8 +441,25 @@
           <w:sz w:val="28"/>
           <w:szCs w:val="28"/>
         </w:rPr>
-        <w:t>8. Find ud af hvordan ModifyOutput kan tilføje til summary der printes når koden kører. Lav et for loop der samler de forskellige data i ModifyOutputs da det er den samme funktionalitet der bruges på de forskellige data.</w:t>
-      </w:r>
+        <w:t xml:space="preserve">8. </w:t>
+      </w:r>
+      <w:r>
+        <w:rPr>
+          <w:sz w:val="28"/>
+          <w:szCs w:val="28"/>
+        </w:rPr>
+        <w:t xml:space="preserve">Finde den rigtige seadepth til VarForc med historiske forcingdata. Dette kan gøres ved at tune mod den observerede temperatur. </w:t>
+      </w:r>
+    </w:p>
+    <w:p>
+      <w:pPr>
+        <w:pStyle w:val="Listeafsnit"/>
+        <w:spacing w:line="360" w:lineRule="auto"/>
+        <w:rPr>
+          <w:sz w:val="28"/>
+          <w:szCs w:val="28"/>
+        </w:rPr>
+      </w:pPr>
     </w:p>
     <w:p>
       <w:pPr>

</xml_diff>

<commit_message>
fjernede hardcoding i HistoricalOutput
</commit_message>
<xml_diff>
--- a/to do liste klima.docx
+++ b/to do liste klima.docx
@@ -76,42 +76,7 @@
           <w:sz w:val="28"/>
           <w:szCs w:val="28"/>
         </w:rPr>
-        <w:t>Fi</w:t>
-      </w:r>
-      <w:r>
-        <w:rPr>
-          <w:sz w:val="28"/>
-          <w:szCs w:val="28"/>
-        </w:rPr>
-        <w:t xml:space="preserve">kse </w:t>
-      </w:r>
-      <w:r>
-        <w:rPr>
-          <w:sz w:val="28"/>
-          <w:szCs w:val="28"/>
-        </w:rPr>
-        <w:t>self</w:t>
-      </w:r>
-      <w:r>
-        <w:rPr>
-          <w:sz w:val="28"/>
-          <w:szCs w:val="28"/>
-        </w:rPr>
-        <w:t xml:space="preserve">.start_year </w:t>
-      </w:r>
-      <w:r>
-        <w:rPr>
-          <w:sz w:val="28"/>
-          <w:szCs w:val="28"/>
-        </w:rPr>
-        <w:t>hardcoding</w:t>
-      </w:r>
-      <w:r>
-        <w:rPr>
-          <w:sz w:val="28"/>
-          <w:szCs w:val="28"/>
-        </w:rPr>
-        <w:t xml:space="preserve"> i HistoricalOutput</w:t>
+        <w:t>Lave mellemrum i HistoricalOutput</w:t>
       </w:r>
     </w:p>
     <w:p>
@@ -134,14 +99,12 @@
         <w:rPr>
           <w:sz w:val="28"/>
           <w:szCs w:val="28"/>
-          <w:lang w:val="en-GB"/>
-        </w:rPr>
-      </w:pPr>
-      <w:r>
-        <w:rPr>
-          <w:sz w:val="28"/>
-          <w:szCs w:val="28"/>
-          <w:lang w:val="en-GB"/>
+        </w:rPr>
+      </w:pPr>
+      <w:r>
+        <w:rPr>
+          <w:sz w:val="28"/>
+          <w:szCs w:val="28"/>
         </w:rPr>
         <w:t xml:space="preserve">2. </w:t>
       </w:r>
@@ -149,26 +112,25 @@
         <w:rPr>
           <w:sz w:val="28"/>
           <w:szCs w:val="28"/>
-          <w:lang w:val="en-GB"/>
-        </w:rPr>
-        <w:t xml:space="preserve">Fjerne hardcoding i HistoricalOutput --&gt; panel </w:t>
-      </w:r>
-      <w:r>
-        <w:rPr>
-          <w:sz w:val="28"/>
-          <w:szCs w:val="28"/>
-          <w:lang w:val="en-GB"/>
-        </w:rPr>
-        <w:t>--&gt; a</w:t>
-      </w:r>
-      <w:r>
-        <w:rPr>
-          <w:sz w:val="28"/>
-          <w:szCs w:val="28"/>
-          <w:lang w:val="en-GB"/>
-        </w:rPr>
-        <w:t>x.set_ylim()</w:t>
-      </w:r>
+        </w:rPr>
+        <w:t>Teste HistoricalData med andre m</w:t>
+      </w:r>
+      <w:r>
+        <w:rPr>
+          <w:sz w:val="28"/>
+          <w:szCs w:val="28"/>
+        </w:rPr>
+        <w:t>odes end VarForc</w:t>
+      </w:r>
+    </w:p>
+    <w:p>
+      <w:pPr>
+        <w:pStyle w:val="Listeafsnit"/>
+        <w:rPr>
+          <w:sz w:val="28"/>
+          <w:szCs w:val="28"/>
+        </w:rPr>
+      </w:pPr>
     </w:p>
     <w:p>
       <w:pPr>
@@ -177,7 +139,6 @@
         <w:rPr>
           <w:sz w:val="28"/>
           <w:szCs w:val="28"/>
-          <w:lang w:val="en-GB"/>
         </w:rPr>
       </w:pPr>
     </w:p>

</xml_diff>

<commit_message>
#tilføjede kommentarer på min egen kode
</commit_message>
<xml_diff>
--- a/to do liste klima.docx
+++ b/to do liste klima.docx
@@ -21,7 +21,7 @@
           <w:szCs w:val="32"/>
           <w:lang w:val="en-GB"/>
         </w:rPr>
-        <w:t>Klima</w:t>
+        <w:t>Prioriteret</w:t>
       </w:r>
       <w:r>
         <w:rPr>
@@ -31,7 +31,7 @@
           <w:szCs w:val="32"/>
           <w:lang w:val="en-GB"/>
         </w:rPr>
-        <w:t xml:space="preserve">kode </w:t>
+        <w:t xml:space="preserve"> </w:t>
       </w:r>
       <w:r>
         <w:rPr>
@@ -43,15 +43,6 @@
         </w:rPr>
         <w:t>to do liste</w:t>
       </w:r>
-    </w:p>
-    <w:p>
-      <w:pPr>
-        <w:pStyle w:val="Listeafsnit"/>
-        <w:rPr>
-          <w:sz w:val="28"/>
-          <w:szCs w:val="28"/>
-        </w:rPr>
-      </w:pPr>
     </w:p>
     <w:p>
       <w:pPr>
@@ -71,88 +62,8 @@
           <w:sz w:val="28"/>
           <w:szCs w:val="28"/>
         </w:rPr>
-        <w:t>Er plots</w:t>
-      </w:r>
-      <w:r>
-        <w:rPr>
-          <w:sz w:val="28"/>
-          <w:szCs w:val="28"/>
-        </w:rPr>
-        <w:t xml:space="preserve"> i kombinationer af modes de rigtige? </w:t>
-      </w:r>
-      <w:r>
-        <w:rPr>
-          <w:sz w:val="28"/>
-          <w:szCs w:val="28"/>
-        </w:rPr>
-        <w:t xml:space="preserve">Teste VarForc med andre modes end HistData. Sikre at </w:t>
-      </w:r>
-      <w:r>
-        <w:rPr>
-          <w:sz w:val="28"/>
-          <w:szCs w:val="28"/>
-        </w:rPr>
-        <w:t>ax.set_</w:t>
-      </w:r>
-      <w:r>
-        <w:rPr>
-          <w:sz w:val="28"/>
-          <w:szCs w:val="28"/>
-        </w:rPr>
-        <w:t xml:space="preserve">ylim algoritmerne i VarForcOutput.panel </w:t>
-      </w:r>
-      <w:r>
-        <w:rPr>
-          <w:sz w:val="28"/>
-          <w:szCs w:val="28"/>
-        </w:rPr>
-        <w:t xml:space="preserve">fungerer som ønsket </w:t>
-      </w:r>
-      <w:r>
-        <w:rPr>
-          <w:sz w:val="28"/>
-          <w:szCs w:val="28"/>
-        </w:rPr>
-        <w:t>med alle slags forcing og temperaturer</w:t>
-      </w:r>
-      <w:r>
-        <w:rPr>
-          <w:sz w:val="28"/>
-          <w:szCs w:val="28"/>
-        </w:rPr>
-        <w:t xml:space="preserve">. Skal modes som SeasonalVariation og VariableForcing sætte en seadepth parameter automatisk? Man kan jo argumentere for at der er </w:t>
-      </w:r>
-      <w:r>
-        <w:rPr>
-          <w:sz w:val="28"/>
-          <w:szCs w:val="28"/>
-        </w:rPr>
-        <w:t>værdier af seadepth der er objektivt de bedste for disse modes. Og skal seasonalvariation gøres kompatibel med historicaldata eller er det ligemeget?</w:t>
-      </w:r>
-      <w:r>
-        <w:rPr>
-          <w:sz w:val="28"/>
-          <w:szCs w:val="28"/>
-        </w:rPr>
-        <w:t xml:space="preserve"> </w:t>
-      </w:r>
-      <w:r>
-        <w:rPr>
-          <w:sz w:val="28"/>
-          <w:szCs w:val="28"/>
-        </w:rPr>
-        <w:t xml:space="preserve">Variableseadepth skal gøres kompatibel med VariableForcing. </w:t>
-      </w:r>
-    </w:p>
-    <w:p>
-      <w:pPr>
-        <w:pStyle w:val="Listeafsnit"/>
-        <w:spacing w:line="360" w:lineRule="auto"/>
-        <w:rPr>
-          <w:sz w:val="28"/>
-          <w:szCs w:val="28"/>
-        </w:rPr>
-      </w:pPr>
+        <w:t>Indlæse land-sea-mask data til brug i SeaDep-moden.</w:t>
+      </w:r>
     </w:p>
     <w:p>
       <w:pPr>
@@ -172,28 +83,58 @@
           <w:sz w:val="28"/>
           <w:szCs w:val="28"/>
         </w:rPr>
-        <w:t>Find ud af hvordan ModifyOutput kan tilføje til summary der printes når koden kører. Lav et for loop der samler de forskellige data i ModifyOutputs da det er den samme funktionalitet der bruges på de forskellige data.</w:t>
-      </w:r>
-      <w:r>
-        <w:rPr>
-          <w:sz w:val="28"/>
-          <w:szCs w:val="28"/>
-        </w:rPr>
-        <w:t xml:space="preserve"> Tjekke at panel ylims er korrekte</w:t>
-      </w:r>
-      <w:r>
-        <w:rPr>
-          <w:sz w:val="28"/>
-          <w:szCs w:val="28"/>
-        </w:rPr>
-        <w:t xml:space="preserve"> til al slags data i </w:t>
-      </w:r>
-      <w:r>
-        <w:rPr>
-          <w:sz w:val="28"/>
-          <w:szCs w:val="28"/>
-        </w:rPr>
-        <w:t xml:space="preserve">ModifyOutput. </w:t>
+        <w:t>Fjerne datafilnavne fra config og definere dem under modes i stedet</w:t>
+      </w:r>
+    </w:p>
+    <w:p>
+      <w:pPr>
+        <w:spacing w:line="360" w:lineRule="auto"/>
+        <w:rPr>
+          <w:sz w:val="28"/>
+          <w:szCs w:val="28"/>
+        </w:rPr>
+      </w:pPr>
+    </w:p>
+    <w:p>
+      <w:pPr>
+        <w:spacing w:line="360" w:lineRule="auto"/>
+        <w:rPr>
+          <w:b/>
+          <w:bCs/>
+          <w:sz w:val="32"/>
+          <w:szCs w:val="32"/>
+          <w:lang w:val="en-GB"/>
+        </w:rPr>
+      </w:pPr>
+      <w:r>
+        <w:rPr>
+          <w:b/>
+          <w:bCs/>
+          <w:sz w:val="32"/>
+          <w:szCs w:val="32"/>
+          <w:lang w:val="en-GB"/>
+        </w:rPr>
+        <w:t>Klima</w:t>
+      </w:r>
+      <w:r>
+        <w:rPr>
+          <w:b/>
+          <w:bCs/>
+          <w:sz w:val="32"/>
+          <w:szCs w:val="32"/>
+          <w:lang w:val="en-GB"/>
+        </w:rPr>
+        <w:t xml:space="preserve">kode </w:t>
+      </w:r>
+      <w:r>
+        <w:rPr>
+          <w:b/>
+          <w:bCs/>
+          <w:sz w:val="32"/>
+          <w:szCs w:val="32"/>
+          <w:lang w:val="en-GB"/>
+        </w:rPr>
+        <w:t>to do liste</w:t>
       </w:r>
     </w:p>
     <w:p>
@@ -202,6 +143,7 @@
         <w:rPr>
           <w:sz w:val="28"/>
           <w:szCs w:val="28"/>
+          <w:lang w:val="en-GB"/>
         </w:rPr>
       </w:pPr>
     </w:p>
@@ -223,33 +165,105 @@
           <w:sz w:val="28"/>
           <w:szCs w:val="28"/>
         </w:rPr>
-        <w:t xml:space="preserve">Indlæse land-sea-mask data til brug i </w:t>
-      </w:r>
-      <w:r>
-        <w:rPr>
-          <w:sz w:val="28"/>
-          <w:szCs w:val="28"/>
-        </w:rPr>
-        <w:t>Sea</w:t>
-      </w:r>
-      <w:r>
-        <w:rPr>
-          <w:sz w:val="28"/>
-          <w:szCs w:val="28"/>
-        </w:rPr>
-        <w:t>Dep</w:t>
-      </w:r>
-      <w:r>
-        <w:rPr>
-          <w:sz w:val="28"/>
-          <w:szCs w:val="28"/>
-        </w:rPr>
-        <w:t>-moden.</w:t>
+        <w:t xml:space="preserve">Sikre at </w:t>
+      </w:r>
+      <w:r>
+        <w:rPr>
+          <w:sz w:val="28"/>
+          <w:szCs w:val="28"/>
+        </w:rPr>
+        <w:t>ax.set_</w:t>
+      </w:r>
+      <w:r>
+        <w:rPr>
+          <w:sz w:val="28"/>
+          <w:szCs w:val="28"/>
+        </w:rPr>
+        <w:t xml:space="preserve">ylim algoritmerne i VarForcOutput.panel </w:t>
+      </w:r>
+      <w:r>
+        <w:rPr>
+          <w:sz w:val="28"/>
+          <w:szCs w:val="28"/>
+        </w:rPr>
+        <w:t xml:space="preserve">fungerer som ønsket </w:t>
+      </w:r>
+      <w:r>
+        <w:rPr>
+          <w:sz w:val="28"/>
+          <w:szCs w:val="28"/>
+        </w:rPr>
+        <w:t>med alle slags forcing og temperaturer</w:t>
+      </w:r>
+      <w:r>
+        <w:rPr>
+          <w:sz w:val="28"/>
+          <w:szCs w:val="28"/>
+        </w:rPr>
+        <w:t xml:space="preserve">. Skal modes som SeasonalVariation og VariableForcing sætte en seadepth parameter automatisk? Man kan jo argumentere for at der er </w:t>
+      </w:r>
+      <w:r>
+        <w:rPr>
+          <w:sz w:val="28"/>
+          <w:szCs w:val="28"/>
+        </w:rPr>
+        <w:t xml:space="preserve">værdier af seadepth der er objektivt de bedste for disse modes. </w:t>
       </w:r>
     </w:p>
     <w:p>
       <w:pPr>
         <w:pStyle w:val="Listeafsnit"/>
+        <w:spacing w:line="360" w:lineRule="auto"/>
+        <w:rPr>
+          <w:sz w:val="28"/>
+          <w:szCs w:val="28"/>
+        </w:rPr>
+      </w:pPr>
+    </w:p>
+    <w:p>
+      <w:pPr>
+        <w:pStyle w:val="Listeafsnit"/>
+        <w:numPr>
+          <w:ilvl w:val="0"/>
+          <w:numId w:val="1"/>
+        </w:numPr>
+        <w:spacing w:line="360" w:lineRule="auto"/>
+        <w:rPr>
+          <w:sz w:val="28"/>
+          <w:szCs w:val="28"/>
+        </w:rPr>
+      </w:pPr>
+      <w:r>
+        <w:rPr>
+          <w:sz w:val="28"/>
+          <w:szCs w:val="28"/>
+        </w:rPr>
+        <w:t>Find ud af hvordan ModifyOutput kan tilføje til summary der printes når koden kører. Lav et for loop der samler de forskellige data i ModifyOutputs da det er den samme funktionalitet der bruges på de forskellige data.</w:t>
+      </w:r>
+      <w:r>
+        <w:rPr>
+          <w:sz w:val="28"/>
+          <w:szCs w:val="28"/>
+        </w:rPr>
+        <w:t xml:space="preserve"> Tjekke at panel ylims er korrekte</w:t>
+      </w:r>
+      <w:r>
+        <w:rPr>
+          <w:sz w:val="28"/>
+          <w:szCs w:val="28"/>
+        </w:rPr>
+        <w:t xml:space="preserve"> til al slags data i </w:t>
+      </w:r>
+      <w:r>
+        <w:rPr>
+          <w:sz w:val="28"/>
+          <w:szCs w:val="28"/>
+        </w:rPr>
+        <w:t xml:space="preserve">ModifyOutput. </w:t>
+      </w:r>
+    </w:p>
+    <w:p>
+      <w:pPr>
         <w:spacing w:line="360" w:lineRule="auto"/>
         <w:rPr>
           <w:sz w:val="28"/>

</xml_diff>